<commit_message>
Update analysis: add baseline figures and policy evaluation plots
</commit_message>
<xml_diff>
--- a/paper/新建 DOCX 文档.docx
+++ b/paper/新建 DOCX 文档.docx
@@ -5,6 +5,55 @@
     <w:p>
       <w:pPr>
         <w:rPr>
+          <w:b/>
+          <w:bCs/>
+          <w:sz w:val="28"/>
+          <w:szCs w:val="28"/>
+        </w:rPr>
+      </w:pPr>
+      <w:r>
+        <w:rPr>
+          <w:rFonts w:ascii="Times New Roman" w:hAnsi="Times New Roman" w:cs="Times New Roman"/>
+          <w:b/>
+          <w:bCs/>
+          <w:sz w:val="28"/>
+          <w:szCs w:val="28"/>
+        </w:rPr>
+        <w:t>​​</w:t>
+      </w:r>
+      <w:r>
+        <w:rPr>
+          <w:b/>
+          <w:bCs/>
+          <w:sz w:val="28"/>
+          <w:szCs w:val="28"/>
+        </w:rPr>
+        <w:t>Targeted Social Prescription: Targeted Matching and Outcome Evaluation</w:t>
+      </w:r>
+      <w:r>
+        <w:rPr>
+          <w:rFonts w:ascii="Times New Roman" w:hAnsi="Times New Roman" w:cs="Times New Roman"/>
+          <w:b/>
+          <w:bCs/>
+          <w:sz w:val="28"/>
+          <w:szCs w:val="28"/>
+        </w:rPr>
+        <w:t>​</w:t>
+      </w:r>
+      <w:r>
+        <w:rPr>
+          <w:b/>
+          <w:bCs/>
+          <w:sz w:val="28"/>
+          <w:szCs w:val="28"/>
+        </w:rPr>
+        <w:t xml:space="preserve"> </w:t>
+      </w:r>
+    </w:p>
+    <w:p>
+      <w:pPr>
+        <w:rPr>
+          <w:rFonts w:hint="eastAsia"/>
           <w:b/>
           <w:bCs/>
           <w:sz w:val="28"/>
@@ -24,6 +73,7 @@
     <w:p>
       <w:pPr>
         <w:rPr>
+          <w:rFonts w:hint="eastAsia"/>
           <w:sz w:val="28"/>
           <w:szCs w:val="28"/>
         </w:rPr>
@@ -37,6 +87,11 @@
       </w:r>
     </w:p>
     <w:p>
+      <w:pPr>
+        <w:rPr>
+          <w:rFonts w:hint="eastAsia"/>
+        </w:rPr>
+      </w:pPr>
       <w:r>
         <w:t xml:space="preserve">Using data from the Health and Retirement Study (HRS), this project developed a rule-based approach to support social prescribing among community-dwelling adults aged 65 and above. Participants were classified based on demographic factors, chronic conditions, functional limitations, depressive symptoms, and prior healthcare use. Service recommendations were generated using predefined criteria. Propensity score matching was applied to compare 12-month </w:t>
       </w:r>
@@ -52,6 +107,7 @@
     <w:p>
       <w:pPr>
         <w:rPr>
+          <w:rFonts w:hint="eastAsia"/>
           <w:sz w:val="28"/>
           <w:szCs w:val="28"/>
         </w:rPr>
@@ -848,6 +904,7 @@
   <w:style w:type="character" w:default="1" w:styleId="a0">
     <w:name w:val="Default Paragraph Font"/>
     <w:uiPriority w:val="1"/>
+    <w:semiHidden/>
     <w:unhideWhenUsed/>
   </w:style>
   <w:style w:type="table" w:default="1" w:styleId="a1">

</xml_diff>